<commit_message>
Bylazora 0.4.0 snapshot: project-first website
</commit_message>
<xml_diff>
--- a/license/Bylazora-Commercial-Licence.docx
+++ b/license/Bylazora-Commercial-Licence.docx
@@ -4,62 +4,142 @@
   <w:body>
     <w:p>
       <w:r>
-        <w:t>Vectorshift Commercial Licence</w:t>
+        <w:t>Provecta Commercial Licence, Version 2</w:t>
       </w:r>
     </w:p>
     <w:p>
       <w:r>
-        <w:t>Copyright (c) 2026 Vectorshift. All rights reserved.</w:t>
+        <w:t>Copyright (c) 2026 Provecta. All rights reserved.</w:t>
       </w:r>
     </w:p>
     <w:p>
       <w:r>
-        <w:t>1. Grant. The licensor grants the licensee a non-exclusive, non-transferable</w:t>
+        <w:t>This licence covers (a) the closed software of Provecta (the licence portal,</w:t>
       </w:r>
     </w:p>
     <w:p>
       <w:r>
-        <w:t>licence to install and use the software and its documentation, in source or</w:t>
+        <w:t>the managed-run dashboard, and their documentation) and (b) a commercial</w:t>
       </w:r>
     </w:p>
     <w:p>
       <w:r>
-        <w:t>binary form, solely for migrating the licensee's own workloads or, under a</w:t>
+        <w:t>licence option for provecta-core for licensees who cannot accept its AGPL</w:t>
       </w:r>
     </w:p>
     <w:p>
       <w:r>
-        <w:t>per-engagement licence, the workloads of a single named client engagement.</w:t>
+        <w:t>terms or who embed it in closed products. provecta-core itself is free</w:t>
       </w:r>
     </w:p>
     <w:p>
       <w:r>
-        <w:t>2. Limits. The licensee may not (a) sublicense, resell, or redistribute the</w:t>
+        <w:t>software under AGPL-3.0-or-later (its parsers under Apache-2.0); nothing in</w:t>
       </w:r>
     </w:p>
     <w:p>
       <w:r>
-        <w:t>software; (b) use the software to operate, or to build, a competing migration</w:t>
+        <w:t>this document changes that.</w:t>
       </w:r>
     </w:p>
     <w:p>
       <w:r>
-        <w:t>service or product; (c) remove or alter any notice of this licence.</w:t>
+        <w:t>1. Closed software. The licensor grants a non-exclusive, non-transferable</w:t>
       </w:r>
     </w:p>
     <w:p>
       <w:r>
-        <w:t>3. Licence models. Annual site licence: use within one named organisation for</w:t>
+        <w:t>licence to use the portal and dashboard, on the licensee's own</w:t>
       </w:r>
     </w:p>
     <w:p>
       <w:r>
-        <w:t>any number of its workloads. Per-engagement licence: use within one named</w:t>
+        <w:t>infrastructure, to manage licence keys and run records. The licensor also</w:t>
       </w:r>
     </w:p>
     <w:p>
       <w:r>
-        <w:t>migration engagement, including by the integrator and the client jointly.</w:t>
+        <w:t>offers these as a hosted managed run; hosted use is by subscription, not</w:t>
+      </w:r>
+    </w:p>
+    <w:p>
+      <w:r>
+        <w:t>under this document.</w:t>
+      </w:r>
+    </w:p>
+    <w:p>
+      <w:r>
+        <w:t>2. Commercial licence for the engine. By order or subscription, the licensor</w:t>
+      </w:r>
+    </w:p>
+    <w:p>
+      <w:r>
+        <w:t>grants one named organisation the right to use, modify, and run</w:t>
+      </w:r>
+    </w:p>
+    <w:p>
+      <w:r>
+        <w:t>provecta-core without the AGPL obligations, including closed embedding,</w:t>
+      </w:r>
+    </w:p>
+    <w:p>
+      <w:r>
+        <w:t>for its own workloads and its client engagements, at any scale and on any</w:t>
+      </w:r>
+    </w:p>
+    <w:p>
+      <w:r>
+        <w:t>number of installations, including installations on its clients' own</w:t>
+      </w:r>
+    </w:p>
+    <w:p>
+      <w:r>
+        <w:t>estates for the duration of an engagement. Every keyed run names the</w:t>
+      </w:r>
+    </w:p>
+    <w:p>
+      <w:r>
+        <w:t>licensee. The client's continued production use after the engagement</w:t>
+      </w:r>
+    </w:p>
+    <w:p>
+      <w:r>
+        <w:t>requires the client's own licence. Key expiry is signed into the key and</w:t>
+      </w:r>
+    </w:p>
+    <w:p>
+      <w:r>
+        <w:t>enforced by the software, so engagement access ends on the licensed date</w:t>
+      </w:r>
+    </w:p>
+    <w:p>
+      <w:r>
+        <w:t>unless renewed. There is no per-installation fee.</w:t>
+      </w:r>
+    </w:p>
+    <w:p>
+      <w:r>
+        <w:t>3. Limits. The licensee may not (a) sublicense, resell, or redistribute the</w:t>
+      </w:r>
+    </w:p>
+    <w:p>
+      <w:r>
+        <w:t>software; (b) use the software to operate, or to build, a competing</w:t>
+      </w:r>
+    </w:p>
+    <w:p>
+      <w:r>
+        <w:t>migration service or product; (c) remove or alter any notice of licence or</w:t>
+      </w:r>
+    </w:p>
+    <w:p>
+      <w:r>
+        <w:t>ownership. For the engine's AGPL path, the AGPL text governs; this licence</w:t>
+      </w:r>
+    </w:p>
+    <w:p>
+      <w:r>
+        <w:t>only grants what the AGPL path cannot.</w:t>
       </w:r>
     </w:p>
     <w:p>
@@ -99,27 +179,22 @@
     </w:p>
     <w:p>
       <w:r>
-        <w:t>6. Order form. This licence is granted only on execution of an order form</w:t>
+        <w:t>6. Privacy and offline operation. The engine performs no network</w:t>
       </w:r>
     </w:p>
     <w:p>
       <w:r>
-        <w:t>that specifies the licence model (annual site or per-engagement), the named</w:t>
+        <w:t>communication and sends no telemetry; licence verification is local, from</w:t>
       </w:r>
     </w:p>
     <w:p>
       <w:r>
-        <w:t>organisation or engagement, the term, the fee, and any minimum-engagement</w:t>
+        <w:t>the key and the system clock, so the software operates in air-gapped</w:t>
       </w:r>
     </w:p>
     <w:p>
       <w:r>
-        <w:t>commitment. Evaluation before an order form is limited to the proof trial:</w:t>
-      </w:r>
-    </w:p>
-    <w:p>
-      <w:r>
-        <w:t>one named client job, for assessment, in the licensee's own environment.</w:t>
+        <w:t>environments.</w:t>
       </w:r>
     </w:p>
     <w:p>
@@ -129,7 +204,12 @@
     </w:p>
     <w:p>
       <w:r>
-        <w:t>Australia. The parties submit to the non-exclusive jurisdiction of its courts.</w:t>
+        <w:t>Australia. The parties submit to the non-exclusive jurisdiction of its</w:t>
+      </w:r>
+    </w:p>
+    <w:p>
+      <w:r>
+        <w:t>courts.</w:t>
       </w:r>
     </w:p>
     <w:p>
@@ -148,7 +228,7 @@
           <w:b/>
           <w:color w:val="1F4E79"/>
         </w:rPr>
-        <w:t>For further information: https://vectorshift.axoquant.com</w:t>
+        <w:t>For further information: https://provecta.dev</w:t>
       </w:r>
     </w:p>
     <w:sectPr>
@@ -171,7 +251,7 @@
       <w:jc w:val="center"/>
     </w:pPr>
     <w:r>
-      <w:t>Provecta | https://vectorshift.axoquant.com | Proof, not percentages</w:t>
+      <w:t>Provecta | https://provecta.dev | Proof, not percentages</w:t>
     </w:r>
   </w:p>
 </w:ftr>
@@ -185,7 +265,7 @@
       <w:jc w:val="center"/>
     </w:pPr>
     <w:r>
-      <w:t>Provecta Commercial Licence  |  https://vectorshift.axoquant.com</w:t>
+      <w:t>Provecta Commercial Licence  |  https://provecta.dev</w:t>
     </w:r>
   </w:p>
 </w:hdr>

</xml_diff>